<commit_message>
QST-Manual: Sonderfaelle auf Seite 3, Logo groesser (Walter 26.08.)
</commit_message>
<xml_diff>
--- a/docs/QST-Benutzer-Manual.docx
+++ b/docs/QST-Benutzer-Manual.docx
@@ -12,7 +12,7 @@
           <w:sz w:val="20"/>
           <w:szCs w:val="20"/>
         </w:rPr>
-        <w:t xml:space="preserve">OneCrew — Benutzer-Manual</w:t>
+        <w:t xml:space="preserve">Benutzer-Manual</w:t>
       </w:r>
     </w:p>
     <w:p>
@@ -344,7 +344,8 @@
     <w:p>
       <w:pPr>
         <w:pStyle w:val="Heading1"/>
-        <w:spacing w:after="140" w:before="300"/>
+        <w:pageBreakBefore/>
+        <w:spacing w:after="140" w:before="0"/>
       </w:pPr>
       <w:r>
         <w:rPr>
@@ -1812,7 +1813,8 @@
     <w:p>
       <w:pPr>
         <w:pStyle w:val="Heading1"/>
-        <w:spacing w:after="140" w:before="300"/>
+        <w:pageBreakBefore/>
+        <w:spacing w:after="140" w:before="0"/>
       </w:pPr>
       <w:r>
         <w:rPr>
@@ -2140,8 +2142,9 @@
       </w:r>
     </w:p>
     <w:sectPr>
+      <w:headerReference w:type="default" r:id="rId7"/>
       <w:pgSz w:w="11906" w:h="16838" w:orient="portrait"/>
-      <w:pgMar w:top="1133" w:right="1247" w:bottom="1020" w:left="1247" w:header="708" w:footer="708" w:gutter="0"/>
+      <w:pgMar w:top="1474" w:right="1247" w:bottom="1020" w:left="1247" w:header="453" w:footer="708" w:gutter="0"/>
       <w:pgNumType/>
       <w:docGrid w:linePitch="360"/>
     </w:sectPr>
@@ -2225,6 +2228,56 @@
     </w:p>
   </w:footnote>
 </w:footnotes>
+</file>
+
+<file path=word/header1.xml><?xml version="1.0" encoding="utf-8"?>
+<w:hdr xmlns:wpc="http://schemas.microsoft.com/office/word/2010/wordprocessingCanvas" xmlns:mc="http://schemas.openxmlformats.org/markup-compatibility/2006" xmlns:o="urn:schemas-microsoft-com:office:office" xmlns:r="http://schemas.openxmlformats.org/officeDocument/2006/relationships" xmlns:m="http://schemas.openxmlformats.org/officeDocument/2006/math" xmlns:v="urn:schemas-microsoft-com:vml" xmlns:wp14="http://schemas.microsoft.com/office/word/2010/wordprocessingDrawing" xmlns:wp="http://schemas.openxmlformats.org/drawingml/2006/wordprocessingDrawing" xmlns:w10="urn:schemas-microsoft-com:office:word" xmlns:w="http://schemas.openxmlformats.org/wordprocessingml/2006/main" xmlns:w14="http://schemas.microsoft.com/office/word/2010/wordml" xmlns:w15="http://schemas.microsoft.com/office/word/2012/wordml" xmlns:wpg="http://schemas.microsoft.com/office/word/2010/wordprocessingGroup" xmlns:wpi="http://schemas.microsoft.com/office/word/2010/wordprocessingInk" xmlns:wne="http://schemas.microsoft.com/office/word/2006/wordml" xmlns:wps="http://schemas.microsoft.com/office/word/2010/wordprocessingShape" xmlns:cx="http://schemas.microsoft.com/office/drawing/2014/chartex" xmlns:cx1="http://schemas.microsoft.com/office/drawing/2015/9/8/chartex" xmlns:cx2="http://schemas.microsoft.com/office/drawing/2015/10/21/chartex" xmlns:cx3="http://schemas.microsoft.com/office/drawing/2016/5/9/chartex" xmlns:cx4="http://schemas.microsoft.com/office/drawing/2016/5/10/chartex" xmlns:cx5="http://schemas.microsoft.com/office/drawing/2016/5/11/chartex" xmlns:cx6="http://schemas.microsoft.com/office/drawing/2016/5/12/chartex" xmlns:cx7="http://schemas.microsoft.com/office/drawing/2016/5/13/chartex" xmlns:cx8="http://schemas.microsoft.com/office/drawing/2016/5/14/chartex" xmlns:w16cid="http://schemas.microsoft.com/office/word/2016/wordml/cid" xmlns:w16se="http://schemas.microsoft.com/office/word/2015/wordml/symex">
+  <w:p>
+    <w:pPr>
+      <w:spacing w:after="0"/>
+    </w:pPr>
+    <w:r>
+      <w:drawing>
+        <wp:inline distT="0" distB="0" distL="0" distR="0">
+          <wp:extent cx="1666875" cy="438150"/>
+          <wp:effectExtent t="0" r="0" b="0" l="0"/>
+          <wp:docPr id="1" name="" descr="" title=""/>
+          <wp:cNvGraphicFramePr>
+            <a:graphicFrameLocks xmlns:a="http://schemas.openxmlformats.org/drawingml/2006/main" noChangeAspect="1"/>
+          </wp:cNvGraphicFramePr>
+          <a:graphic xmlns:a="http://schemas.openxmlformats.org/drawingml/2006/main">
+            <a:graphicData uri="http://schemas.openxmlformats.org/drawingml/2006/picture">
+              <pic:pic xmlns:pic="http://schemas.openxmlformats.org/drawingml/2006/picture">
+                <pic:nvPicPr>
+                  <pic:cNvPr id="0" name="" descr=""/>
+                  <pic:cNvPicPr>
+                    <a:picLocks noChangeAspect="1" noChangeArrowheads="1"/>
+                  </pic:cNvPicPr>
+                </pic:nvPicPr>
+                <pic:blipFill>
+                  <a:blip r:embed="rId0" cstate="none"/>
+                  <a:srcRect/>
+                  <a:stretch>
+                    <a:fillRect/>
+                  </a:stretch>
+                </pic:blipFill>
+                <pic:spPr bwMode="auto">
+                  <a:xfrm>
+                    <a:off x="0" y="0"/>
+                    <a:ext cx="1666875" cy="438150"/>
+                  </a:xfrm>
+                  <a:prstGeom prst="rect">
+                    <a:avLst/>
+                  </a:prstGeom>
+                </pic:spPr>
+              </pic:pic>
+            </a:graphicData>
+          </a:graphic>
+        </wp:inline>
+      </w:drawing>
+    </w:r>
+  </w:p>
+</w:hdr>
 </file>
 
 <file path=word/numbering.xml><?xml version="1.0" encoding="utf-8"?>

</xml_diff>